<commit_message>
Ecclesiastes 2nd re-audit (Sep 25): 2 MSG restorations (5:11 + 7:21-22 duplicate/misplaced EN fixed), GDocs 12/12 verified
</commit_message>
<xml_diff>
--- a/gdocs_build/Ecclesiastes.docx
+++ b/gdocs_build/Ecclesiastes.docx
@@ -3486,7 +3486,7 @@
               <w:rPr>
                 <w:sz w:val="18"/>
               </w:rPr>
-              <w:t>If you're all about money, you'll never have enough. If you're obsessed with being rich, you'll never be satisfied. It's all just chasing smoke.</w:t>
+              <w:t>The more stuff you have, the more people show up to take it from you. And what's the fun in that—getting robbed in broad daylight?</w:t>
             </w:r>
           </w:p>
         </w:tc>
@@ -5679,7 +5679,7 @@
               <w:rPr>
                 <w:sz w:val="18"/>
               </w:rPr>
-              <w:t>Wisdom gives one wise person more strength than ten strong men give their city.</w:t>
+              <w:t>Don't eavesdrop on other people's conversations. What if the gossip's about you and it's stuff you'd rather not hear? Come on, you've done it a few times yourself—said things behind someone's back you'd never say to their face.</w:t>
             </w:r>
           </w:p>
         </w:tc>

</xml_diff>